<commit_message>
Generate and complete Task 9 Word report. Task 9 Complete!
</commit_message>
<xml_diff>
--- a/Portfolio WP2/9_Unjuk_Kerja Melaksanakan Pengujian Unit Program - Nugraha Jody.docx
+++ b/Portfolio WP2/9_Unjuk_Kerja Melaksanakan Pengujian Unit Program - Nugraha Jody.docx
@@ -692,23 +692,119 @@
       </w:tr>
     </w:tbl>
     <w:p>
+      <w:r>
+        <w:br/>
+        <w:t>Dokumentasi Hasil Pengujian Login:</w:t>
+      </w:r>
+    </w:p>
+    <w:p>
       <w:pPr>
-        <w:spacing w:before="200" w:after="400"/>
+        <w:spacing w:before="160" w:after="80"/>
+        <w:jc w:val="center"/>
+      </w:pPr>
+      <w:r>
+        <w:drawing>
+          <wp:inline xmlns:a="http://schemas.openxmlformats.org/drawingml/2006/main" xmlns:pic="http://schemas.openxmlformats.org/drawingml/2006/picture">
+            <wp:extent cx="4572000" cy="2424410"/>
+            <wp:docPr id="1" name="Picture 1"/>
+            <wp:cNvGraphicFramePr>
+              <a:graphicFrameLocks noChangeAspect="1"/>
+            </wp:cNvGraphicFramePr>
+            <a:graphic>
+              <a:graphicData uri="http://schemas.openxmlformats.org/drawingml/2006/picture">
+                <pic:pic>
+                  <pic:nvPicPr>
+                    <pic:cNvPr id="0" name="media__1783251348847.png"/>
+                    <pic:cNvPicPr/>
+                  </pic:nvPicPr>
+                  <pic:blipFill>
+                    <a:blip r:embed="rId9"/>
+                    <a:stretch>
+                      <a:fillRect/>
+                    </a:stretch>
+                  </pic:blipFill>
+                  <pic:spPr>
+                    <a:xfrm>
+                      <a:off x="0" y="0"/>
+                      <a:ext cx="4572000" cy="2424410"/>
+                    </a:xfrm>
+                    <a:prstGeom prst="rect"/>
+                  </pic:spPr>
+                </pic:pic>
+              </a:graphicData>
+            </a:graphic>
+          </wp:inline>
+        </w:drawing>
+      </w:r>
+    </w:p>
+    <w:p>
+      <w:pPr>
+        <w:spacing w:after="300"/>
         <w:jc w:val="center"/>
       </w:pPr>
       <w:r>
         <w:rPr>
-          <w:b/>
-          <w:color w:val="EF4444"/>
+          <w:rFonts w:ascii="Arial" w:hAnsi="Arial"/>
+          <w:i/>
+          <w:color w:val="64748B"/>
+          <w:sz w:val="18"/>
         </w:rPr>
-        <w:t>[ TEMPEL SCREENSHOT PENGUJIAN LOGIN SCENARIO 1-5 DI SINI ]</w:t>
-        <w:br/>
+        <w:t>(Screenshot: Tampilan Error Validasi Kredensial Salah pada Halaman Login)</w:t>
       </w:r>
+    </w:p>
+    <w:p>
+      <w:pPr>
+        <w:spacing w:before="160" w:after="80"/>
+        <w:jc w:val="center"/>
+      </w:pPr>
+      <w:r>
+        <w:drawing>
+          <wp:inline xmlns:a="http://schemas.openxmlformats.org/drawingml/2006/main" xmlns:pic="http://schemas.openxmlformats.org/drawingml/2006/picture">
+            <wp:extent cx="4572000" cy="2419945"/>
+            <wp:docPr id="2" name="Picture 2"/>
+            <wp:cNvGraphicFramePr>
+              <a:graphicFrameLocks noChangeAspect="1"/>
+            </wp:cNvGraphicFramePr>
+            <a:graphic>
+              <a:graphicData uri="http://schemas.openxmlformats.org/drawingml/2006/picture">
+                <pic:pic>
+                  <pic:nvPicPr>
+                    <pic:cNvPr id="0" name="media__1783251367530.png"/>
+                    <pic:cNvPicPr/>
+                  </pic:nvPicPr>
+                  <pic:blipFill>
+                    <a:blip r:embed="rId10"/>
+                    <a:stretch>
+                      <a:fillRect/>
+                    </a:stretch>
+                  </pic:blipFill>
+                  <pic:spPr>
+                    <a:xfrm>
+                      <a:off x="0" y="0"/>
+                      <a:ext cx="4572000" cy="2419945"/>
+                    </a:xfrm>
+                    <a:prstGeom prst="rect"/>
+                  </pic:spPr>
+                </pic:pic>
+              </a:graphicData>
+            </a:graphic>
+          </wp:inline>
+        </w:drawing>
+      </w:r>
+    </w:p>
+    <w:p>
+      <w:pPr>
+        <w:spacing w:after="300"/>
+        <w:jc w:val="center"/>
+      </w:pPr>
       <w:r>
         <w:rPr>
+          <w:rFonts w:ascii="Arial" w:hAnsi="Arial"/>
           <w:i/>
+          <w:color w:val="64748B"/>
+          <w:sz w:val="18"/>
         </w:rPr>
-        <w:t>(Ambil screenshot halaman login saat validation error, login gagal, dan login berhasil)</w:t>
+        <w:t>(Screenshot: Tampilan Halaman Utama Dashboard Admin Setelah Sukses Login)</w:t>
       </w:r>
     </w:p>
     <w:p>
@@ -1060,23 +1156,119 @@
       </w:tr>
     </w:tbl>
     <w:p>
+      <w:r>
+        <w:br/>
+        <w:t>Dokumentasi Hasil Pengujian Booking:</w:t>
+      </w:r>
+    </w:p>
+    <w:p>
       <w:pPr>
-        <w:spacing w:before="200" w:after="400"/>
+        <w:spacing w:before="160" w:after="80"/>
+        <w:jc w:val="center"/>
+      </w:pPr>
+      <w:r>
+        <w:drawing>
+          <wp:inline xmlns:a="http://schemas.openxmlformats.org/drawingml/2006/main" xmlns:pic="http://schemas.openxmlformats.org/drawingml/2006/picture">
+            <wp:extent cx="4572000" cy="2402086"/>
+            <wp:docPr id="3" name="Picture 3"/>
+            <wp:cNvGraphicFramePr>
+              <a:graphicFrameLocks noChangeAspect="1"/>
+            </wp:cNvGraphicFramePr>
+            <a:graphic>
+              <a:graphicData uri="http://schemas.openxmlformats.org/drawingml/2006/picture">
+                <pic:pic>
+                  <pic:nvPicPr>
+                    <pic:cNvPr id="0" name="media__1783248903524.png"/>
+                    <pic:cNvPicPr/>
+                  </pic:nvPicPr>
+                  <pic:blipFill>
+                    <a:blip r:embed="rId11"/>
+                    <a:stretch>
+                      <a:fillRect/>
+                    </a:stretch>
+                  </pic:blipFill>
+                  <pic:spPr>
+                    <a:xfrm>
+                      <a:off x="0" y="0"/>
+                      <a:ext cx="4572000" cy="2402086"/>
+                    </a:xfrm>
+                    <a:prstGeom prst="rect"/>
+                  </pic:spPr>
+                </pic:pic>
+              </a:graphicData>
+            </a:graphic>
+          </wp:inline>
+        </w:drawing>
+      </w:r>
+    </w:p>
+    <w:p>
+      <w:pPr>
+        <w:spacing w:after="300"/>
         <w:jc w:val="center"/>
       </w:pPr>
       <w:r>
         <w:rPr>
-          <w:b/>
-          <w:color w:val="EF4444"/>
+          <w:rFonts w:ascii="Arial" w:hAnsi="Arial"/>
+          <w:i/>
+          <w:color w:val="64748B"/>
+          <w:sz w:val="18"/>
         </w:rPr>
-        <w:t>[ TEMPEL SCREENSHOT PENGUJIAN BOOKING SCENARIO 1-2 DI SINI ]</w:t>
-        <w:br/>
+        <w:t>(Screenshot: Tampilan Pesan Validasi Error 'Nomer plat wajib diisi' saat Submit Form)</w:t>
       </w:r>
+    </w:p>
+    <w:p>
+      <w:pPr>
+        <w:spacing w:before="160" w:after="80"/>
+        <w:jc w:val="center"/>
+      </w:pPr>
+      <w:r>
+        <w:drawing>
+          <wp:inline xmlns:a="http://schemas.openxmlformats.org/drawingml/2006/main" xmlns:pic="http://schemas.openxmlformats.org/drawingml/2006/picture">
+            <wp:extent cx="4572000" cy="2446734"/>
+            <wp:docPr id="4" name="Picture 4"/>
+            <wp:cNvGraphicFramePr>
+              <a:graphicFrameLocks noChangeAspect="1"/>
+            </wp:cNvGraphicFramePr>
+            <a:graphic>
+              <a:graphicData uri="http://schemas.openxmlformats.org/drawingml/2006/picture">
+                <pic:pic>
+                  <pic:nvPicPr>
+                    <pic:cNvPr id="0" name="media__1783248761336.png"/>
+                    <pic:cNvPicPr/>
+                  </pic:nvPicPr>
+                  <pic:blipFill>
+                    <a:blip r:embed="rId12"/>
+                    <a:stretch>
+                      <a:fillRect/>
+                    </a:stretch>
+                  </pic:blipFill>
+                  <pic:spPr>
+                    <a:xfrm>
+                      <a:off x="0" y="0"/>
+                      <a:ext cx="4572000" cy="2446734"/>
+                    </a:xfrm>
+                    <a:prstGeom prst="rect"/>
+                  </pic:spPr>
+                </pic:pic>
+              </a:graphicData>
+            </a:graphic>
+          </wp:inline>
+        </w:drawing>
+      </w:r>
+    </w:p>
+    <w:p>
+      <w:pPr>
+        <w:spacing w:after="300"/>
+        <w:jc w:val="center"/>
+      </w:pPr>
       <w:r>
         <w:rPr>
+          <w:rFonts w:ascii="Arial" w:hAnsi="Arial"/>
           <w:i/>
+          <w:color w:val="64748B"/>
+          <w:sz w:val="18"/>
         </w:rPr>
-        <w:t>(Ambil screenshot validasi error plat nomor dan struk sukses booking)</w:t>
+        <w:t>(Screenshot: Tampilan Data Transaksi Booking yang Berhasil Masuk di Tabel Dashboard)</w:t>
       </w:r>
     </w:p>
     <w:p>
@@ -1516,23 +1708,119 @@
       </w:tr>
     </w:tbl>
     <w:p>
+      <w:r>
+        <w:br/>
+        <w:t>Dokumentasi Hasil Pengujian Kelola Mekanik:</w:t>
+      </w:r>
+    </w:p>
+    <w:p>
       <w:pPr>
-        <w:spacing w:before="200" w:after="400"/>
+        <w:spacing w:before="160" w:after="80"/>
+        <w:jc w:val="center"/>
+      </w:pPr>
+      <w:r>
+        <w:drawing>
+          <wp:inline xmlns:a="http://schemas.openxmlformats.org/drawingml/2006/main" xmlns:pic="http://schemas.openxmlformats.org/drawingml/2006/picture">
+            <wp:extent cx="4572000" cy="2477988"/>
+            <wp:docPr id="5" name="Picture 5"/>
+            <wp:cNvGraphicFramePr>
+              <a:graphicFrameLocks noChangeAspect="1"/>
+            </wp:cNvGraphicFramePr>
+            <a:graphic>
+              <a:graphicData uri="http://schemas.openxmlformats.org/drawingml/2006/picture">
+                <pic:pic>
+                  <pic:nvPicPr>
+                    <pic:cNvPr id="0" name="media__1783246261504.png"/>
+                    <pic:cNvPicPr/>
+                  </pic:nvPicPr>
+                  <pic:blipFill>
+                    <a:blip r:embed="rId13"/>
+                    <a:stretch>
+                      <a:fillRect/>
+                    </a:stretch>
+                  </pic:blipFill>
+                  <pic:spPr>
+                    <a:xfrm>
+                      <a:off x="0" y="0"/>
+                      <a:ext cx="4572000" cy="2477988"/>
+                    </a:xfrm>
+                    <a:prstGeom prst="rect"/>
+                  </pic:spPr>
+                </pic:pic>
+              </a:graphicData>
+            </a:graphic>
+          </wp:inline>
+        </w:drawing>
+      </w:r>
+    </w:p>
+    <w:p>
+      <w:pPr>
+        <w:spacing w:after="300"/>
         <w:jc w:val="center"/>
       </w:pPr>
       <w:r>
         <w:rPr>
-          <w:b/>
-          <w:color w:val="EF4444"/>
+          <w:rFonts w:ascii="Arial" w:hAnsi="Arial"/>
+          <w:i/>
+          <w:color w:val="64748B"/>
+          <w:sz w:val="18"/>
         </w:rPr>
-        <w:t>[ TEMPEL SCREENSHOT CRUD DATA MEKANIK SCENARIO 1-3 DI SINI ]</w:t>
-        <w:br/>
+        <w:t>(Screenshot: Tampilan Alert Sukses Penambahan Data Mekanik Baru)</w:t>
       </w:r>
+    </w:p>
+    <w:p>
+      <w:pPr>
+        <w:spacing w:before="160" w:after="80"/>
+        <w:jc w:val="center"/>
+      </w:pPr>
+      <w:r>
+        <w:drawing>
+          <wp:inline xmlns:a="http://schemas.openxmlformats.org/drawingml/2006/main" xmlns:pic="http://schemas.openxmlformats.org/drawingml/2006/picture">
+            <wp:extent cx="4572000" cy="2428875"/>
+            <wp:docPr id="6" name="Picture 6"/>
+            <wp:cNvGraphicFramePr>
+              <a:graphicFrameLocks noChangeAspect="1"/>
+            </wp:cNvGraphicFramePr>
+            <a:graphic>
+              <a:graphicData uri="http://schemas.openxmlformats.org/drawingml/2006/picture">
+                <pic:pic>
+                  <pic:nvPicPr>
+                    <pic:cNvPr id="0" name="media__1783246371379.png"/>
+                    <pic:cNvPicPr/>
+                  </pic:nvPicPr>
+                  <pic:blipFill>
+                    <a:blip r:embed="rId14"/>
+                    <a:stretch>
+                      <a:fillRect/>
+                    </a:stretch>
+                  </pic:blipFill>
+                  <pic:spPr>
+                    <a:xfrm>
+                      <a:off x="0" y="0"/>
+                      <a:ext cx="4572000" cy="2428875"/>
+                    </a:xfrm>
+                    <a:prstGeom prst="rect"/>
+                  </pic:spPr>
+                </pic:pic>
+              </a:graphicData>
+            </a:graphic>
+          </wp:inline>
+        </w:drawing>
+      </w:r>
+    </w:p>
+    <w:p>
+      <w:pPr>
+        <w:spacing w:after="300"/>
+        <w:jc w:val="center"/>
+      </w:pPr>
       <w:r>
         <w:rPr>
+          <w:rFonts w:ascii="Arial" w:hAnsi="Arial"/>
           <w:i/>
+          <w:color w:val="64748B"/>
+          <w:sz w:val="18"/>
         </w:rPr>
-        <w:t>(Ambil screenshot halaman tambah data, edit data, dan konfirmasi hapus mekanik)</w:t>
+        <w:t>(Screenshot: Dialog Konfirmasi Konfirmasi Hapus Data Mekanik)</w:t>
       </w:r>
     </w:p>
     <w:sectPr>

</xml_diff>

<commit_message>
Embed latest booking screenshots into Task 9 Word report document
</commit_message>
<xml_diff>
--- a/Portfolio WP2/9_Unjuk_Kerja Melaksanakan Pengujian Unit Program - Nugraha Jody.docx
+++ b/Portfolio WP2/9_Unjuk_Kerja Melaksanakan Pengujian Unit Program - Nugraha Jody.docx
@@ -1100,11 +1100,11 @@
                 <w:color w:val="0F172A"/>
                 <w:sz w:val="18"/>
               </w:rPr>
-              <w:t>Plat: B 1234 KEV</w:t>
+              <w:t>Plat: B 2345 ZAD</w:t>
               <w:br/>
-              <w:t>Tipe Motor: Lainnya</w:t>
+              <w:t>Tipe Motor: Honda Vario 160</w:t>
               <w:br/>
-              <w:t>Tanggal: 30-07-2026</w:t>
+              <w:t>Tanggal: 23-12-2026</w:t>
             </w:r>
           </w:p>
         </w:tc>
@@ -1119,7 +1119,7 @@
                 <w:color w:val="0F172A"/>
                 <w:sz w:val="18"/>
               </w:rPr>
-              <w:t>Sistem berhasil menyimpan data booking, menampilkan alert sukses, dan data muncul di tabel antrean dashboard</w:t>
+              <w:t>Sistem berhasil menyimpan data booking, menampilkan alert sukses 'Booking berhasil!', dan data disimpan ke database</w:t>
             </w:r>
           </w:p>
         </w:tc>
@@ -1169,7 +1169,7 @@
       <w:r>
         <w:drawing>
           <wp:inline xmlns:a="http://schemas.openxmlformats.org/drawingml/2006/main" xmlns:pic="http://schemas.openxmlformats.org/drawingml/2006/picture">
-            <wp:extent cx="4572000" cy="2402086"/>
+            <wp:extent cx="4572000" cy="2424410"/>
             <wp:docPr id="3" name="Picture 3"/>
             <wp:cNvGraphicFramePr>
               <a:graphicFrameLocks noChangeAspect="1"/>
@@ -1178,7 +1178,7 @@
               <a:graphicData uri="http://schemas.openxmlformats.org/drawingml/2006/picture">
                 <pic:pic>
                   <pic:nvPicPr>
-                    <pic:cNvPr id="0" name="media__1783248903524.png"/>
+                    <pic:cNvPr id="0" name="media__1783251554630.png"/>
                     <pic:cNvPicPr/>
                   </pic:nvPicPr>
                   <pic:blipFill>
@@ -1190,7 +1190,7 @@
                   <pic:spPr>
                     <a:xfrm>
                       <a:off x="0" y="0"/>
-                      <a:ext cx="4572000" cy="2402086"/>
+                      <a:ext cx="4572000" cy="2424410"/>
                     </a:xfrm>
                     <a:prstGeom prst="rect"/>
                   </pic:spPr>
@@ -1224,7 +1224,7 @@
       <w:r>
         <w:drawing>
           <wp:inline xmlns:a="http://schemas.openxmlformats.org/drawingml/2006/main" xmlns:pic="http://schemas.openxmlformats.org/drawingml/2006/picture">
-            <wp:extent cx="4572000" cy="2446734"/>
+            <wp:extent cx="4572000" cy="2424410"/>
             <wp:docPr id="4" name="Picture 4"/>
             <wp:cNvGraphicFramePr>
               <a:graphicFrameLocks noChangeAspect="1"/>
@@ -1233,7 +1233,7 @@
               <a:graphicData uri="http://schemas.openxmlformats.org/drawingml/2006/picture">
                 <pic:pic>
                   <pic:nvPicPr>
-                    <pic:cNvPr id="0" name="media__1783248761336.png"/>
+                    <pic:cNvPr id="0" name="media__1783251573263.png"/>
                     <pic:cNvPicPr/>
                   </pic:nvPicPr>
                   <pic:blipFill>
@@ -1245,7 +1245,7 @@
                   <pic:spPr>
                     <a:xfrm>
                       <a:off x="0" y="0"/>
-                      <a:ext cx="4572000" cy="2446734"/>
+                      <a:ext cx="4572000" cy="2424410"/>
                     </a:xfrm>
                     <a:prstGeom prst="rect"/>
                   </pic:spPr>
@@ -1268,7 +1268,7 @@
           <w:color w:val="64748B"/>
           <w:sz w:val="18"/>
         </w:rPr>
-        <w:t>(Screenshot: Tampilan Data Transaksi Booking yang Berhasil Masuk di Tabel Dashboard)</w:t>
+        <w:t>(Screenshot: Tampilan Notifikasi Sukses Simpan Booking Baru ('Booking berhasil!'))</w:t>
       </w:r>
     </w:p>
     <w:p>

</xml_diff>

<commit_message>
Embed before-after mechanic edit screenshots into Task 9 Word report document
</commit_message>
<xml_diff>
--- a/Portfolio WP2/9_Unjuk_Kerja Melaksanakan Pengujian Unit Program - Nugraha Jody.docx
+++ b/Portfolio WP2/9_Unjuk_Kerja Melaksanakan Pengujian Unit Program - Nugraha Jody.docx
@@ -1564,7 +1564,9 @@
                 <w:color w:val="0F172A"/>
                 <w:sz w:val="18"/>
               </w:rPr>
-              <w:t>Keahlian diubah menjadi: Spesialis Karburator</w:t>
+              <w:t>Nama: Mahdi Ibrahim</w:t>
+              <w:br/>
+              <w:t>Keahlian diubah menjadi: Mesin</w:t>
             </w:r>
           </w:p>
         </w:tc>
@@ -1579,7 +1581,7 @@
                 <w:color w:val="0F172A"/>
                 <w:sz w:val="18"/>
               </w:rPr>
-              <w:t>Sistem memperbarui data, menampilkan pesan sukses update data</w:t>
+              <w:t>Sistem memperbarui data keahlian mekanik Mahdi Ibrahim dari Kelistrikan menjadi Mesin</w:t>
             </w:r>
           </w:p>
         </w:tc>
@@ -1776,8 +1778,118 @@
       <w:r>
         <w:drawing>
           <wp:inline xmlns:a="http://schemas.openxmlformats.org/drawingml/2006/main" xmlns:pic="http://schemas.openxmlformats.org/drawingml/2006/picture">
+            <wp:extent cx="4572000" cy="2424410"/>
+            <wp:docPr id="6" name="Picture 6"/>
+            <wp:cNvGraphicFramePr>
+              <a:graphicFrameLocks noChangeAspect="1"/>
+            </wp:cNvGraphicFramePr>
+            <a:graphic>
+              <a:graphicData uri="http://schemas.openxmlformats.org/drawingml/2006/picture">
+                <pic:pic>
+                  <pic:nvPicPr>
+                    <pic:cNvPr id="0" name="media__1783251700880.png"/>
+                    <pic:cNvPicPr/>
+                  </pic:nvPicPr>
+                  <pic:blipFill>
+                    <a:blip r:embed="rId14"/>
+                    <a:stretch>
+                      <a:fillRect/>
+                    </a:stretch>
+                  </pic:blipFill>
+                  <pic:spPr>
+                    <a:xfrm>
+                      <a:off x="0" y="0"/>
+                      <a:ext cx="4572000" cy="2424410"/>
+                    </a:xfrm>
+                    <a:prstGeom prst="rect"/>
+                  </pic:spPr>
+                </pic:pic>
+              </a:graphicData>
+            </a:graphic>
+          </wp:inline>
+        </w:drawing>
+      </w:r>
+    </w:p>
+    <w:p>
+      <w:pPr>
+        <w:spacing w:after="300"/>
+        <w:jc w:val="center"/>
+      </w:pPr>
+      <w:r>
+        <w:rPr>
+          <w:rFonts w:ascii="Arial" w:hAnsi="Arial"/>
+          <w:i/>
+          <w:color w:val="64748B"/>
+          <w:sz w:val="18"/>
+        </w:rPr>
+        <w:t>(Screenshot: Sebelum/Sedang Edit: Data Mekanik Dipopulasikan ke Form Input)</w:t>
+      </w:r>
+    </w:p>
+    <w:p>
+      <w:pPr>
+        <w:spacing w:before="160" w:after="80"/>
+        <w:jc w:val="center"/>
+      </w:pPr>
+      <w:r>
+        <w:drawing>
+          <wp:inline xmlns:a="http://schemas.openxmlformats.org/drawingml/2006/main" xmlns:pic="http://schemas.openxmlformats.org/drawingml/2006/picture">
+            <wp:extent cx="4572000" cy="2411016"/>
+            <wp:docPr id="7" name="Picture 7"/>
+            <wp:cNvGraphicFramePr>
+              <a:graphicFrameLocks noChangeAspect="1"/>
+            </wp:cNvGraphicFramePr>
+            <a:graphic>
+              <a:graphicData uri="http://schemas.openxmlformats.org/drawingml/2006/picture">
+                <pic:pic>
+                  <pic:nvPicPr>
+                    <pic:cNvPr id="0" name="media__1783251905970.png"/>
+                    <pic:cNvPicPr/>
+                  </pic:nvPicPr>
+                  <pic:blipFill>
+                    <a:blip r:embed="rId15"/>
+                    <a:stretch>
+                      <a:fillRect/>
+                    </a:stretch>
+                  </pic:blipFill>
+                  <pic:spPr>
+                    <a:xfrm>
+                      <a:off x="0" y="0"/>
+                      <a:ext cx="4572000" cy="2411016"/>
+                    </a:xfrm>
+                    <a:prstGeom prst="rect"/>
+                  </pic:spPr>
+                </pic:pic>
+              </a:graphicData>
+            </a:graphic>
+          </wp:inline>
+        </w:drawing>
+      </w:r>
+    </w:p>
+    <w:p>
+      <w:pPr>
+        <w:spacing w:after="300"/>
+        <w:jc w:val="center"/>
+      </w:pPr>
+      <w:r>
+        <w:rPr>
+          <w:rFonts w:ascii="Arial" w:hAnsi="Arial"/>
+          <w:i/>
+          <w:color w:val="64748B"/>
+          <w:sz w:val="18"/>
+        </w:rPr>
+        <w:t>(Screenshot: Sesudah Edit: Keahlian Mekanik Mahdi Ibrahim Berhasil Terupdate Menjadi 'Mesin')</w:t>
+      </w:r>
+    </w:p>
+    <w:p>
+      <w:pPr>
+        <w:spacing w:before="160" w:after="80"/>
+        <w:jc w:val="center"/>
+      </w:pPr>
+      <w:r>
+        <w:drawing>
+          <wp:inline xmlns:a="http://schemas.openxmlformats.org/drawingml/2006/main" xmlns:pic="http://schemas.openxmlformats.org/drawingml/2006/picture">
             <wp:extent cx="4572000" cy="2428875"/>
-            <wp:docPr id="6" name="Picture 6"/>
+            <wp:docPr id="8" name="Picture 8"/>
             <wp:cNvGraphicFramePr>
               <a:graphicFrameLocks noChangeAspect="1"/>
             </wp:cNvGraphicFramePr>
@@ -1789,7 +1901,7 @@
                     <pic:cNvPicPr/>
                   </pic:nvPicPr>
                   <pic:blipFill>
-                    <a:blip r:embed="rId14"/>
+                    <a:blip r:embed="rId16"/>
                     <a:stretch>
                       <a:fillRect/>
                     </a:stretch>

</xml_diff>

<commit_message>
Embed before-after mechanic delete screenshots into Task 9 Word report document
</commit_message>
<xml_diff>
--- a/Portfolio WP2/9_Unjuk_Kerja Melaksanakan Pengujian Unit Program - Nugraha Jody.docx
+++ b/Portfolio WP2/9_Unjuk_Kerja Melaksanakan Pengujian Unit Program - Nugraha Jody.docx
@@ -1119,7 +1119,7 @@
                 <w:color w:val="0F172A"/>
                 <w:sz w:val="18"/>
               </w:rPr>
-              <w:t>Sistem berhasil menyimpan data booking, menampilkan alert sukses 'Booking berhasil!', dan data disimpan ke database</w:t>
+              <w:t>Sistem berhasil menyimpan data booking, menampilkan alert sukses 'Booking berhasil!', and data disimpan ke database</w:t>
             </w:r>
           </w:p>
         </w:tc>
@@ -1888,7 +1888,7 @@
       <w:r>
         <w:drawing>
           <wp:inline xmlns:a="http://schemas.openxmlformats.org/drawingml/2006/main" xmlns:pic="http://schemas.openxmlformats.org/drawingml/2006/picture">
-            <wp:extent cx="4572000" cy="2428875"/>
+            <wp:extent cx="4572000" cy="2419945"/>
             <wp:docPr id="8" name="Picture 8"/>
             <wp:cNvGraphicFramePr>
               <a:graphicFrameLocks noChangeAspect="1"/>
@@ -1897,7 +1897,7 @@
               <a:graphicData uri="http://schemas.openxmlformats.org/drawingml/2006/picture">
                 <pic:pic>
                   <pic:nvPicPr>
-                    <pic:cNvPr id="0" name="media__1783246371379.png"/>
+                    <pic:cNvPr id="0" name="media__1783251984309.png"/>
                     <pic:cNvPicPr/>
                   </pic:nvPicPr>
                   <pic:blipFill>
@@ -1909,7 +1909,7 @@
                   <pic:spPr>
                     <a:xfrm>
                       <a:off x="0" y="0"/>
-                      <a:ext cx="4572000" cy="2428875"/>
+                      <a:ext cx="4572000" cy="2419945"/>
                     </a:xfrm>
                     <a:prstGeom prst="rect"/>
                   </pic:spPr>
@@ -1932,7 +1932,117 @@
           <w:color w:val="64748B"/>
           <w:sz w:val="18"/>
         </w:rPr>
-        <w:t>(Screenshot: Dialog Konfirmasi Konfirmasi Hapus Data Mekanik)</w:t>
+        <w:t>(Screenshot: Sebelum Hapus: Menunjuk Tombol Hapus pada Karyawan Bjordyyy)</w:t>
+      </w:r>
+    </w:p>
+    <w:p>
+      <w:pPr>
+        <w:spacing w:before="160" w:after="80"/>
+        <w:jc w:val="center"/>
+      </w:pPr>
+      <w:r>
+        <w:drawing>
+          <wp:inline xmlns:a="http://schemas.openxmlformats.org/drawingml/2006/main" xmlns:pic="http://schemas.openxmlformats.org/drawingml/2006/picture">
+            <wp:extent cx="4572000" cy="2433340"/>
+            <wp:docPr id="9" name="Picture 9"/>
+            <wp:cNvGraphicFramePr>
+              <a:graphicFrameLocks noChangeAspect="1"/>
+            </wp:cNvGraphicFramePr>
+            <a:graphic>
+              <a:graphicData uri="http://schemas.openxmlformats.org/drawingml/2006/picture">
+                <pic:pic>
+                  <pic:nvPicPr>
+                    <pic:cNvPr id="0" name="media__1783252001795.png"/>
+                    <pic:cNvPicPr/>
+                  </pic:nvPicPr>
+                  <pic:blipFill>
+                    <a:blip r:embed="rId17"/>
+                    <a:stretch>
+                      <a:fillRect/>
+                    </a:stretch>
+                  </pic:blipFill>
+                  <pic:spPr>
+                    <a:xfrm>
+                      <a:off x="0" y="0"/>
+                      <a:ext cx="4572000" cy="2433340"/>
+                    </a:xfrm>
+                    <a:prstGeom prst="rect"/>
+                  </pic:spPr>
+                </pic:pic>
+              </a:graphicData>
+            </a:graphic>
+          </wp:inline>
+        </w:drawing>
+      </w:r>
+    </w:p>
+    <w:p>
+      <w:pPr>
+        <w:spacing w:after="300"/>
+        <w:jc w:val="center"/>
+      </w:pPr>
+      <w:r>
+        <w:rPr>
+          <w:rFonts w:ascii="Arial" w:hAnsi="Arial"/>
+          <w:i/>
+          <w:color w:val="64748B"/>
+          <w:sz w:val="18"/>
+        </w:rPr>
+        <w:t>(Screenshot: Sedang Hapus: Tampilan Konfirmasi Hapus Data Mekanik)</w:t>
+      </w:r>
+    </w:p>
+    <w:p>
+      <w:pPr>
+        <w:spacing w:before="160" w:after="80"/>
+        <w:jc w:val="center"/>
+      </w:pPr>
+      <w:r>
+        <w:drawing>
+          <wp:inline xmlns:a="http://schemas.openxmlformats.org/drawingml/2006/main" xmlns:pic="http://schemas.openxmlformats.org/drawingml/2006/picture">
+            <wp:extent cx="4572000" cy="2424410"/>
+            <wp:docPr id="10" name="Picture 10"/>
+            <wp:cNvGraphicFramePr>
+              <a:graphicFrameLocks noChangeAspect="1"/>
+            </wp:cNvGraphicFramePr>
+            <a:graphic>
+              <a:graphicData uri="http://schemas.openxmlformats.org/drawingml/2006/picture">
+                <pic:pic>
+                  <pic:nvPicPr>
+                    <pic:cNvPr id="0" name="media__1783252022520.png"/>
+                    <pic:cNvPicPr/>
+                  </pic:nvPicPr>
+                  <pic:blipFill>
+                    <a:blip r:embed="rId18"/>
+                    <a:stretch>
+                      <a:fillRect/>
+                    </a:stretch>
+                  </pic:blipFill>
+                  <pic:spPr>
+                    <a:xfrm>
+                      <a:off x="0" y="0"/>
+                      <a:ext cx="4572000" cy="2424410"/>
+                    </a:xfrm>
+                    <a:prstGeom prst="rect"/>
+                  </pic:spPr>
+                </pic:pic>
+              </a:graphicData>
+            </a:graphic>
+          </wp:inline>
+        </w:drawing>
+      </w:r>
+    </w:p>
+    <w:p>
+      <w:pPr>
+        <w:spacing w:after="300"/>
+        <w:jc w:val="center"/>
+      </w:pPr>
+      <w:r>
+        <w:rPr>
+          <w:rFonts w:ascii="Arial" w:hAnsi="Arial"/>
+          <w:i/>
+          <w:color w:val="64748B"/>
+          <w:sz w:val="18"/>
+        </w:rPr>
+        <w:t>(Screenshot: Setelah Hapus: Data Mekanik Bjordyyy Berhasil Terhapus dari Sistem)</w:t>
       </w:r>
     </w:p>
     <w:sectPr>

</xml_diff>

<commit_message>
Prevent table row splitting across page breaks in Task 9 Word report
</commit_message>
<xml_diff>
--- a/Portfolio WP2/9_Unjuk_Kerja Melaksanakan Pengujian Unit Program - Nugraha Jody.docx
+++ b/Portfolio WP2/9_Unjuk_Kerja Melaksanakan Pengujian Unit Program - Nugraha Jody.docx
@@ -99,6 +99,9 @@
         <w:gridCol w:w="1440"/>
       </w:tblGrid>
       <w:tr>
+        <w:trPr>
+          <w:cantSplit/>
+        </w:trPr>
         <w:tc>
           <w:tcPr>
             <w:tcW w:type="dxa" w:w="1440"/>
@@ -221,6 +224,9 @@
         </w:tc>
       </w:tr>
       <w:tr>
+        <w:trPr>
+          <w:cantSplit/>
+        </w:trPr>
         <w:tc>
           <w:tcPr>
             <w:tcW w:type="dxa" w:w="1440"/>
@@ -315,6 +321,9 @@
         </w:tc>
       </w:tr>
       <w:tr>
+        <w:trPr>
+          <w:cantSplit/>
+        </w:trPr>
         <w:tc>
           <w:tcPr>
             <w:tcW w:type="dxa" w:w="1440"/>
@@ -409,6 +418,9 @@
         </w:tc>
       </w:tr>
       <w:tr>
+        <w:trPr>
+          <w:cantSplit/>
+        </w:trPr>
         <w:tc>
           <w:tcPr>
             <w:tcW w:type="dxa" w:w="1440"/>
@@ -503,6 +515,9 @@
         </w:tc>
       </w:tr>
       <w:tr>
+        <w:trPr>
+          <w:cantSplit/>
+        </w:trPr>
         <w:tc>
           <w:tcPr>
             <w:tcW w:type="dxa" w:w="1440"/>
@@ -597,6 +612,9 @@
         </w:tc>
       </w:tr>
       <w:tr>
+        <w:trPr>
+          <w:cantSplit/>
+        </w:trPr>
         <w:tc>
           <w:tcPr>
             <w:tcW w:type="dxa" w:w="1440"/>
@@ -841,6 +859,9 @@
         <w:gridCol w:w="1440"/>
       </w:tblGrid>
       <w:tr>
+        <w:trPr>
+          <w:cantSplit/>
+        </w:trPr>
         <w:tc>
           <w:tcPr>
             <w:tcW w:type="dxa" w:w="1440"/>
@@ -963,6 +984,9 @@
         </w:tc>
       </w:tr>
       <w:tr>
+        <w:trPr>
+          <w:cantSplit/>
+        </w:trPr>
         <w:tc>
           <w:tcPr>
             <w:tcW w:type="dxa" w:w="1440"/>
@@ -1059,6 +1083,9 @@
         </w:tc>
       </w:tr>
       <w:tr>
+        <w:trPr>
+          <w:cantSplit/>
+        </w:trPr>
         <w:tc>
           <w:tcPr>
             <w:tcW w:type="dxa" w:w="1440"/>
@@ -1305,6 +1332,9 @@
         <w:gridCol w:w="1440"/>
       </w:tblGrid>
       <w:tr>
+        <w:trPr>
+          <w:cantSplit/>
+        </w:trPr>
         <w:tc>
           <w:tcPr>
             <w:tcW w:type="dxa" w:w="1440"/>
@@ -1427,6 +1457,9 @@
         </w:tc>
       </w:tr>
       <w:tr>
+        <w:trPr>
+          <w:cantSplit/>
+        </w:trPr>
         <w:tc>
           <w:tcPr>
             <w:tcW w:type="dxa" w:w="1440"/>
@@ -1523,6 +1556,9 @@
         </w:tc>
       </w:tr>
       <w:tr>
+        <w:trPr>
+          <w:cantSplit/>
+        </w:trPr>
         <w:tc>
           <w:tcPr>
             <w:tcW w:type="dxa" w:w="1440"/>
@@ -1617,6 +1653,9 @@
         </w:tc>
       </w:tr>
       <w:tr>
+        <w:trPr>
+          <w:cantSplit/>
+        </w:trPr>
         <w:tc>
           <w:tcPr>
             <w:tcW w:type="dxa" w:w="1440"/>

</xml_diff>